<commit_message>
Update outline v9 with Phase 4 completion, architecture migration, decisions log
</commit_message>
<xml_diff>
--- a/reference/visa/Visa_Project_Outline_v9.docx
+++ b/reference/visa/Visa_Project_Outline_v9.docx
@@ -64,6 +64,44 @@
           <w:szCs w:val="26"/>
         </w:rPr>
         <w:t xml:space="preserve">One machine. Two visa programs. The same people get rich.</w:t>
+      </w:r>
+    </w:p>
+    <w:p>
+      <w:r>
+        <w:rPr>
+          <w:b/>
+        </w:rPr>
+        <w:t>ARCHITECTURE UPDATE — APRIL 2026</w:t>
+      </w:r>
+    </w:p>
+    <w:p>
+      <w:r>
+        <w:t>Tool migrated from single HTML file to multi-page static site hosted on GitHub Pages.</w:t>
+      </w:r>
+    </w:p>
+    <w:p>
+      <w:r>
+        <w:t>Live URL: https://istuckert.github.io/Incentive-Machine/</w:t>
+      </w:r>
+    </w:p>
+    <w:p>
+      <w:r>
+        <w:t>Platform name changed to: The Manufactured Divide</w:t>
+      </w:r>
+    </w:p>
+    <w:p>
+      <w:r>
+        <w:t>First module name: H-1B / H-2: The Visa Machine</w:t>
+      </w:r>
+    </w:p>
+    <w:p>
+      <w:r>
+        <w:t>Tagline confirmed: "The argument is the product."</w:t>
+      </w:r>
+    </w:p>
+    <w:p>
+      <w:r>
+        <w:t>Build environment: Plain HTML/CSS/JS — no framework, no build tools, no backend.</w:t>
       </w:r>
     </w:p>
     <w:p>
@@ -4634,11 +4672,7 @@
         <w:spacing w:after="80" w:before="60"/>
       </w:pPr>
       <w:r>
-        <w:rPr>
-          <w:sz w:val="22"/>
-          <w:szCs w:val="22"/>
-        </w:rPr>
-        <w:t xml:space="preserve">Placeholder tables with FY2025 H-1B data populated. Full Phase 4 research pending.</w:t>
+        <w:t>Status: Research complete as of April 2026. Build pending. All data documented in Master Research File Chapter 09-A through 09-L.</w:t>
       </w:r>
     </w:p>
     <w:p>
@@ -4706,6 +4740,123 @@
           <w:szCs w:val="21"/>
         </w:rPr>
         <w:t xml:space="preserve">•  This is the phase that closes the loop between visa programs and retirement account funding</w:t>
+      </w:r>
+    </w:p>
+    <w:p>
+      <w:r>
+        <w:rPr>
+          <w:b/>
+        </w:rPr>
+        <w:t>VERIFIED PHASE 4 DATA (April 2026)</w:t>
+      </w:r>
+    </w:p>
+    <w:p>
+      <w:r>
+        <w:rPr>
+          <w:b/>
+        </w:rPr>
+        <w:t>Big Three ownership — Top H-1B Sponsors (Q4 2025 13F):</w:t>
+      </w:r>
+    </w:p>
+    <w:p>
+      <w:r>
+        <w:t>•  Amazon: Vanguard 7.86% / BlackRock 6.83% / State Street 3.61%</w:t>
+      </w:r>
+    </w:p>
+    <w:p>
+      <w:r>
+        <w:t>•  Meta: Vanguard 7.91% / BlackRock 6.78% / State Street 3.59%</w:t>
+      </w:r>
+    </w:p>
+    <w:p>
+      <w:r>
+        <w:t>•  Microsoft: Vanguard 9.67% / BlackRock 8.11% / State Street 4.12%</w:t>
+      </w:r>
+    </w:p>
+    <w:p>
+      <w:r>
+        <w:t>•  Google: Vanguard 7.74% / BlackRock 6.64% / State Street 3.44%</w:t>
+      </w:r>
+    </w:p>
+    <w:p>
+      <w:r>
+        <w:t>•  TCS: Vanguard 0.77% / BlackRock 1.04% / State Street &lt;0.5%</w:t>
+      </w:r>
+    </w:p>
+    <w:p>
+      <w:r>
+        <w:t>Federal lobbying 2025: Meta $26.29M / Amazon $18.87M / Google $16.54M / Microsoft $10.11M / TCS $1.04M</w:t>
+      </w:r>
+    </w:p>
+    <w:p>
+      <w:r>
+        <w:t>PAC contributions 2023–2024: All four US sponsors split near 50/50 Dem/Rep — bipartisan access strategy</w:t>
+      </w:r>
+    </w:p>
+    <w:p>
+      <w:r>
+        <w:t>Trump 2025 inaugural: Amazon, Meta, Microsoft, Google each donated $1M simultaneously</w:t>
+      </w:r>
+    </w:p>
+    <w:p>
+      <w:r>
+        <w:t>Federal contracts: Amazon/AWS ~$798M / Microsoft ~$532M / Google low tens of millions / Meta negligible / TCS minimal</w:t>
+      </w:r>
+    </w:p>
+    <w:p>
+      <w:r>
+        <w:t>State subsidies: Amazon $11.6B+ / Google $2.319B / Microsoft $1.602B / Meta $60M+ / TCS none</w:t>
+      </w:r>
+    </w:p>
+    <w:p>
+      <w:r>
+        <w:rPr>
+          <w:b/>
+        </w:rPr>
+        <w:t>TCS Consulting Scheme — Key Finding:</w:t>
+      </w:r>
+    </w:p>
+    <w:p>
+      <w:r>
+        <w:t>TCS acts as middleman — sponsors H-1B visas but deploys workers to end-client companies.</w:t>
+      </w:r>
+    </w:p>
+    <w:p>
+      <w:r>
+        <w:t>Documented end clients: Citigroup (largest, ~3,000 contractors 2020–2024), JPMorgan, Wells Fargo, Goldman Sachs, Capital One, Verizon, AT&amp;T, Walmart, Barclays.</w:t>
+      </w:r>
+    </w:p>
+    <w:p>
+      <w:r>
+        <w:t>Big Three own all end-client companies at 5–10% stakes — same ownership loop extends to TCS clients.</w:t>
+      </w:r>
+    </w:p>
+    <w:p>
+      <w:r>
+        <w:rPr>
+          <w:b/>
+        </w:rPr>
+        <w:t>H-1B Approvals vs Layoffs — Same Companies Same Years:</w:t>
+      </w:r>
+    </w:p>
+    <w:p>
+      <w:r>
+        <w:t>•  Amazon: 4,644 new H-1B FY2025 + ~30,000 US layoffs</w:t>
+      </w:r>
+    </w:p>
+    <w:p>
+      <w:r>
+        <w:t>•  Meta: 1,555 new H-1B FY2025 (+112% vs FY2023) + ~21,000 layoffs</w:t>
+      </w:r>
+    </w:p>
+    <w:p>
+      <w:r>
+        <w:t>•  Microsoft: 1,394 new H-1B FY2025 + ~15,000 layoffs same year</w:t>
+      </w:r>
+    </w:p>
+    <w:p>
+      <w:r>
+        <w:t>•  Google: 1,050 new H-1B FY2025 + no major layoffs</w:t>
       </w:r>
     </w:p>
     <w:p>
@@ -6904,51 +7055,66 @@
       </w:r>
     </w:p>
     <w:p>
-      <w:pPr>
-        <w:spacing w:after="60" w:before="40"/>
-        <w:ind w:left="360"/>
-      </w:pPr>
-      <w:r>
-        <w:rPr>
-          <w:i/>
-          <w:iCs/>
-          <w:color w:val="b87c00"/>
-          <w:sz w:val="18"/>
-          <w:szCs w:val="18"/>
-        </w:rPr>
-        <w:t xml:space="preserve">⚑ Pending: USASpending.gov — per-company federal contract data</w:t>
-      </w:r>
-    </w:p>
-    <w:p>
-      <w:pPr>
-        <w:spacing w:after="60" w:before="40"/>
-        <w:ind w:left="360"/>
-      </w:pPr>
-      <w:r>
-        <w:rPr>
-          <w:i/>
-          <w:iCs/>
-          <w:color w:val="b87c00"/>
-          <w:sz w:val="18"/>
-          <w:szCs w:val="18"/>
-        </w:rPr>
-        <w:t xml:space="preserve">⚑ Pending: FEC.gov — PAC contribution data per company</w:t>
-      </w:r>
-    </w:p>
-    <w:p>
-      <w:pPr>
-        <w:spacing w:after="60" w:before="40"/>
-        <w:ind w:left="360"/>
-      </w:pPr>
-      <w:r>
-        <w:rPr>
-          <w:i/>
-          <w:iCs/>
-          <w:color w:val="b87c00"/>
-          <w:sz w:val="18"/>
-          <w:szCs w:val="18"/>
-        </w:rPr>
-        <w:t xml:space="preserve">⚑ Pending: SEC 13F filings — cross-ownership exact percentages (confirm Vanguard/BlackRock/State Street)</w:t>
+      <w:r>
+        <w:rPr>
+          <w:b/>
+        </w:rPr>
+        <w:t>PHASE 4 — COMPLETE (April 2026):</w:t>
+      </w:r>
+    </w:p>
+    <w:p>
+      <w:r>
+        <w:t>•  ✓ Per-company ownership chain confirmed — SEC 13F Q4 2025</w:t>
+      </w:r>
+    </w:p>
+    <w:p>
+      <w:r>
+        <w:t>•  ✓ Federal contract receipts — USASpending.gov</w:t>
+      </w:r>
+    </w:p>
+    <w:p>
+      <w:r>
+        <w:t>•  ✓ Lobbying expenditures — OpenSecrets 2025</w:t>
+      </w:r>
+    </w:p>
+    <w:p>
+      <w:r>
+        <w:t>•  ✓ PAC contributions — FEC 2023–2024 cycle</w:t>
+      </w:r>
+    </w:p>
+    <w:p>
+      <w:r>
+        <w:t>•  ✓ Layoff records vs H-1B hiring — WARN Act / CNBC / Reuters</w:t>
+      </w:r>
+    </w:p>
+    <w:p>
+      <w:r>
+        <w:t>•  ✓ TCS end-client documentation — Bloomberg 2025 investigation</w:t>
+      </w:r>
+    </w:p>
+    <w:p>
+      <w:r>
+        <w:t>•  ✓ State subsidies — Good Jobs First Subsidy Tracker</w:t>
+      </w:r>
+    </w:p>
+    <w:p>
+      <w:r>
+        <w:t>•  ✓ Federal tax paid — ITEP / Macrotrends / company 10-Ks</w:t>
+      </w:r>
+    </w:p>
+    <w:p>
+      <w:r>
+        <w:t>•  ✓ Trump 2025 inaugural donations — Guardian / CNBC</w:t>
+      </w:r>
+    </w:p>
+    <w:p>
+      <w:r>
+        <w:t>•  ✓ Job type breakdown per sponsor — myvisajobs.com / h1bscope.com</w:t>
+      </w:r>
+    </w:p>
+    <w:p>
+      <w:r>
+        <w:t>•  REMAINING: H-2 PE intermediary chain (KKR/Blackstone) — still pending</w:t>
       </w:r>
     </w:p>
     <w:p>
@@ -7163,14 +7329,7 @@
           </w:tcPr>
           <w:p>
             <w:r>
-              <w:rPr>
-                <w:b w:val="false"/>
-                <w:bCs w:val="false"/>
-                <w:color w:val="1a6b1a"/>
-                <w:sz w:val="20"/>
-                <w:szCs w:val="20"/>
-              </w:rPr>
-              <w:t xml:space="preserve">✓ Complete</w:t>
+              <w:t>✓ Complete — migrated to multi-page static site</w:t>
             </w:r>
           </w:p>
         </w:tc>
@@ -7193,14 +7352,7 @@
           </w:tcPr>
           <w:p>
             <w:r>
-              <w:rPr>
-                <w:b w:val="false"/>
-                <w:bCs w:val="false"/>
-                <w:color w:val="1a1a2e"/>
-                <w:sz w:val="20"/>
-                <w:szCs w:val="20"/>
-              </w:rPr>
-              <w:t xml:space="preserve">v1–v3</w:t>
+              <w:t>v1–v3</w:t>
             </w:r>
           </w:p>
         </w:tc>
@@ -7255,14 +7407,7 @@
           </w:tcPr>
           <w:p>
             <w:r>
-              <w:rPr>
-                <w:b w:val="false"/>
-                <w:bCs w:val="false"/>
-                <w:color w:val="1a6b1a"/>
-                <w:sz w:val="20"/>
-                <w:szCs w:val="20"/>
-              </w:rPr>
-              <w:t xml:space="preserve">✓ Substantially Complete</w:t>
+              <w:t>✓ Substantially Complete</w:t>
             </w:r>
           </w:p>
         </w:tc>
@@ -7285,14 +7430,7 @@
           </w:tcPr>
           <w:p>
             <w:r>
-              <w:rPr>
-                <w:b w:val="false"/>
-                <w:bCs w:val="false"/>
-                <w:color w:val="1a1a2e"/>
-                <w:sz w:val="20"/>
-                <w:szCs w:val="20"/>
-              </w:rPr>
-              <w:t xml:space="preserve">Content written, visuals built, sources verified. SEC 13F cross-ownership percentages to confirm.</w:t>
+              <w:t>Content written, visuals built, sources verified. Vote flow diagram and foundation text added to visa/index.html. SEC 13F cross-ownership percentages confirmed.</w:t>
             </w:r>
           </w:p>
         </w:tc>
@@ -7347,6 +7485,84 @@
           </w:tcPr>
           <w:p>
             <w:r>
+              <w:t>🔶 Partial</w:t>
+            </w:r>
+          </w:p>
+        </w:tc>
+        <w:tc>
+          <w:tcPr>
+            <w:tcW w:type="dxa" w:w="5560"/>
+            <w:tcBorders>
+              <w:top w:val="single" w:color="CCCCCC" w:sz="1"/>
+              <w:left w:val="single" w:color="CCCCCC" w:sz="1"/>
+              <w:bottom w:val="single" w:color="CCCCCC" w:sz="1"/>
+              <w:right w:val="single" w:color="CCCCCC" w:sz="1"/>
+            </w:tcBorders>
+            <w:shd w:fill="f0f2f8" w:val="clear"/>
+            <w:tcMar>
+              <w:top w:type="dxa" w:w="80"/>
+              <w:left w:type="dxa" w:w="120"/>
+              <w:bottom w:type="dxa" w:w="80"/>
+              <w:right w:type="dxa" w:w="120"/>
+            </w:tcMar>
+          </w:tcPr>
+          <w:p>
+            <w:r>
+              <w:t>Sponsor table live. Scale, wage, rubber-stamp, and visa-dependency data now verified and slotted. Approval trend chart data now available (NFAP/USCIS 1992–2026).</w:t>
+            </w:r>
+          </w:p>
+        </w:tc>
+      </w:tr>
+      <w:tr>
+        <w:tc>
+          <w:tcPr>
+            <w:tcW w:type="dxa" w:w="2200"/>
+            <w:tcBorders>
+              <w:top w:val="single" w:color="CCCCCC" w:sz="1"/>
+              <w:left w:val="single" w:color="CCCCCC" w:sz="1"/>
+              <w:bottom w:val="single" w:color="CCCCCC" w:sz="1"/>
+              <w:right w:val="single" w:color="CCCCCC" w:sz="1"/>
+            </w:tcBorders>
+            <w:shd w:fill="ffffff" w:val="clear"/>
+            <w:tcMar>
+              <w:top w:type="dxa" w:w="80"/>
+              <w:left w:type="dxa" w:w="120"/>
+              <w:bottom w:type="dxa" w:w="80"/>
+              <w:right w:type="dxa" w:w="120"/>
+            </w:tcMar>
+          </w:tcPr>
+          <w:p>
+            <w:r>
+              <w:rPr>
+                <w:b w:val="false"/>
+                <w:bCs w:val="false"/>
+                <w:color w:val="1a1a2e"/>
+                <w:sz w:val="20"/>
+                <w:szCs w:val="20"/>
+              </w:rPr>
+              <w:t xml:space="preserve">Phase 3b — H-2 Visa</w:t>
+            </w:r>
+          </w:p>
+        </w:tc>
+        <w:tc>
+          <w:tcPr>
+            <w:tcW w:type="dxa" w:w="1600"/>
+            <w:tcBorders>
+              <w:top w:val="single" w:color="CCCCCC" w:sz="1"/>
+              <w:left w:val="single" w:color="CCCCCC" w:sz="1"/>
+              <w:bottom w:val="single" w:color="CCCCCC" w:sz="1"/>
+              <w:right w:val="single" w:color="CCCCCC" w:sz="1"/>
+            </w:tcBorders>
+            <w:shd w:fill="ffffff" w:val="clear"/>
+            <w:tcMar>
+              <w:top w:type="dxa" w:w="80"/>
+              <w:left w:type="dxa" w:w="120"/>
+              <w:bottom w:type="dxa" w:w="80"/>
+              <w:right w:type="dxa" w:w="120"/>
+            </w:tcMar>
+          </w:tcPr>
+          <w:p>
+            <w:r>
               <w:rPr>
                 <w:b w:val="false"/>
                 <w:bCs w:val="false"/>
@@ -7367,7 +7583,7 @@
               <w:bottom w:val="single" w:color="CCCCCC" w:sz="1"/>
               <w:right w:val="single" w:color="CCCCCC" w:sz="1"/>
             </w:tcBorders>
-            <w:shd w:fill="f0f2f8" w:val="clear"/>
+            <w:shd w:fill="ffffff" w:val="clear"/>
             <w:tcMar>
               <w:top w:type="dxa" w:w="80"/>
               <w:left w:type="dxa" w:w="120"/>
@@ -7384,7 +7600,7 @@
                 <w:sz w:val="20"/>
                 <w:szCs w:val="20"/>
               </w:rPr>
-              <w:t xml:space="preserve">Sponsor table live. Scale, wage, rubber-stamp, and visa-dependency data now verified and slotted. Approval trend chart pending.</w:t>
+              <w:t xml:space="preserve">Sponsor tables live. AEWR, housing, abuse, and enforcement data now verified and slotted. H-2B data remains thinner.</w:t>
             </w:r>
           </w:p>
         </w:tc>
@@ -7399,7 +7615,7 @@
               <w:bottom w:val="single" w:color="CCCCCC" w:sz="1"/>
               <w:right w:val="single" w:color="CCCCCC" w:sz="1"/>
             </w:tcBorders>
-            <w:shd w:fill="ffffff" w:val="clear"/>
+            <w:shd w:fill="f0f2f8" w:val="clear"/>
             <w:tcMar>
               <w:top w:type="dxa" w:w="80"/>
               <w:left w:type="dxa" w:w="120"/>
@@ -7416,7 +7632,85 @@
                 <w:sz w:val="20"/>
                 <w:szCs w:val="20"/>
               </w:rPr>
-              <w:t xml:space="preserve">Phase 3b — H-2 Visa</w:t>
+              <w:t xml:space="preserve">Phase 4 — Corporate Layer</w:t>
+            </w:r>
+          </w:p>
+        </w:tc>
+        <w:tc>
+          <w:tcPr>
+            <w:tcW w:type="dxa" w:w="1600"/>
+            <w:tcBorders>
+              <w:top w:val="single" w:color="CCCCCC" w:sz="1"/>
+              <w:left w:val="single" w:color="CCCCCC" w:sz="1"/>
+              <w:bottom w:val="single" w:color="CCCCCC" w:sz="1"/>
+              <w:right w:val="single" w:color="CCCCCC" w:sz="1"/>
+            </w:tcBorders>
+            <w:shd w:fill="f0f2f8" w:val="clear"/>
+            <w:tcMar>
+              <w:top w:type="dxa" w:w="80"/>
+              <w:left w:type="dxa" w:w="120"/>
+              <w:bottom w:type="dxa" w:w="80"/>
+              <w:right w:type="dxa" w:w="120"/>
+            </w:tcMar>
+          </w:tcPr>
+          <w:p>
+            <w:r>
+              <w:t>✓ Research Complete — Build Pending</w:t>
+            </w:r>
+          </w:p>
+        </w:tc>
+        <w:tc>
+          <w:tcPr>
+            <w:tcW w:type="dxa" w:w="5560"/>
+            <w:tcBorders>
+              <w:top w:val="single" w:color="CCCCCC" w:sz="1"/>
+              <w:left w:val="single" w:color="CCCCCC" w:sz="1"/>
+              <w:bottom w:val="single" w:color="CCCCCC" w:sz="1"/>
+              <w:right w:val="single" w:color="CCCCCC" w:sz="1"/>
+            </w:tcBorders>
+            <w:shd w:fill="f0f2f8" w:val="clear"/>
+            <w:tcMar>
+              <w:top w:type="dxa" w:w="80"/>
+              <w:left w:type="dxa" w:w="120"/>
+              <w:bottom w:type="dxa" w:w="80"/>
+              <w:right w:type="dxa" w:w="120"/>
+            </w:tcMar>
+          </w:tcPr>
+          <w:p>
+            <w:r>
+              <w:t>All ownership chains, federal contracts, state subsidies, lobbying, PAC, inaugural donations, layoff data, job types, TCS scheme — documented in Master Research Chapter 09-A through 09-L.</w:t>
+            </w:r>
+          </w:p>
+        </w:tc>
+      </w:tr>
+      <w:tr>
+        <w:tc>
+          <w:tcPr>
+            <w:tcW w:type="dxa" w:w="2200"/>
+            <w:tcBorders>
+              <w:top w:val="single" w:color="CCCCCC" w:sz="1"/>
+              <w:left w:val="single" w:color="CCCCCC" w:sz="1"/>
+              <w:bottom w:val="single" w:color="CCCCCC" w:sz="1"/>
+              <w:right w:val="single" w:color="CCCCCC" w:sz="1"/>
+            </w:tcBorders>
+            <w:shd w:fill="ffffff" w:val="clear"/>
+            <w:tcMar>
+              <w:top w:type="dxa" w:w="80"/>
+              <w:left w:type="dxa" w:w="120"/>
+              <w:bottom w:type="dxa" w:w="80"/>
+              <w:right w:type="dxa" w:w="120"/>
+            </w:tcMar>
+          </w:tcPr>
+          <w:p>
+            <w:r>
+              <w:rPr>
+                <w:b w:val="false"/>
+                <w:bCs w:val="false"/>
+                <w:color w:val="1a1a2e"/>
+                <w:sz w:val="20"/>
+                <w:szCs w:val="20"/>
+              </w:rPr>
+              <w:t xml:space="preserve">Phase 5 — Dichotomy of Truth</w:t>
             </w:r>
           </w:p>
         </w:tc>
@@ -7476,7 +7770,7 @@
                 <w:sz w:val="20"/>
                 <w:szCs w:val="20"/>
               </w:rPr>
-              <w:t xml:space="preserve">Sponsor tables live. AEWR, housing, abuse, and enforcement data now verified and slotted. H-2B data remains thinner.</w:t>
+              <w:t xml:space="preserve">Renamed from Dichotomy of Extraction. Four panels (H-1B worker, H-1B American, H-2 worker, H-2 American) fully populated with verified data. Chain node labels updated.</w:t>
             </w:r>
           </w:p>
         </w:tc>
@@ -7508,7 +7802,7 @@
                 <w:sz w:val="20"/>
                 <w:szCs w:val="20"/>
               </w:rPr>
-              <w:t xml:space="preserve">Phase 4 — Corporate Layer</w:t>
+              <w:t xml:space="preserve">Phase 6 — Political Flip</w:t>
             </w:r>
           </w:p>
         </w:tc>
@@ -7568,7 +7862,7 @@
                 <w:sz w:val="20"/>
                 <w:szCs w:val="20"/>
               </w:rPr>
-              <w:t xml:space="preserve">Structure built. USASpending, OpenSecrets, FEC, EPI wage savings not yet pulled. Asset-manager tie-in flags identified.</w:t>
+              <w:t xml:space="preserve">Placeholder text and structure in place. Full research pending.</w:t>
             </w:r>
           </w:p>
         </w:tc>
@@ -7600,7 +7894,7 @@
                 <w:sz w:val="20"/>
                 <w:szCs w:val="20"/>
               </w:rPr>
-              <w:t xml:space="preserve">Phase 5 — Dichotomy of Truth</w:t>
+              <w:t xml:space="preserve">Phase 7 — Polish &amp; Distribution</w:t>
             </w:r>
           </w:p>
         </w:tc>
@@ -7614,98 +7908,6 @@
               <w:right w:val="single" w:color="CCCCCC" w:sz="1"/>
             </w:tcBorders>
             <w:shd w:fill="ffffff" w:val="clear"/>
-            <w:tcMar>
-              <w:top w:type="dxa" w:w="80"/>
-              <w:left w:type="dxa" w:w="120"/>
-              <w:bottom w:type="dxa" w:w="80"/>
-              <w:right w:type="dxa" w:w="120"/>
-            </w:tcMar>
-          </w:tcPr>
-          <w:p>
-            <w:r>
-              <w:rPr>
-                <w:b w:val="false"/>
-                <w:bCs w:val="false"/>
-                <w:color w:val="b87c00"/>
-                <w:sz w:val="20"/>
-                <w:szCs w:val="20"/>
-              </w:rPr>
-              <w:t xml:space="preserve">🔶 Partial</w:t>
-            </w:r>
-          </w:p>
-        </w:tc>
-        <w:tc>
-          <w:tcPr>
-            <w:tcW w:type="dxa" w:w="5560"/>
-            <w:tcBorders>
-              <w:top w:val="single" w:color="CCCCCC" w:sz="1"/>
-              <w:left w:val="single" w:color="CCCCCC" w:sz="1"/>
-              <w:bottom w:val="single" w:color="CCCCCC" w:sz="1"/>
-              <w:right w:val="single" w:color="CCCCCC" w:sz="1"/>
-            </w:tcBorders>
-            <w:shd w:fill="ffffff" w:val="clear"/>
-            <w:tcMar>
-              <w:top w:type="dxa" w:w="80"/>
-              <w:left w:type="dxa" w:w="120"/>
-              <w:bottom w:type="dxa" w:w="80"/>
-              <w:right w:type="dxa" w:w="120"/>
-            </w:tcMar>
-          </w:tcPr>
-          <w:p>
-            <w:r>
-              <w:rPr>
-                <w:b w:val="false"/>
-                <w:bCs w:val="false"/>
-                <w:color w:val="1a1a2e"/>
-                <w:sz w:val="20"/>
-                <w:szCs w:val="20"/>
-              </w:rPr>
-              <w:t xml:space="preserve">Renamed from Dichotomy of Extraction. Four panels (H-1B worker, H-1B American, H-2 worker, H-2 American) fully populated with verified data. Chain node labels updated.</w:t>
-            </w:r>
-          </w:p>
-        </w:tc>
-      </w:tr>
-      <w:tr>
-        <w:tc>
-          <w:tcPr>
-            <w:tcW w:type="dxa" w:w="2200"/>
-            <w:tcBorders>
-              <w:top w:val="single" w:color="CCCCCC" w:sz="1"/>
-              <w:left w:val="single" w:color="CCCCCC" w:sz="1"/>
-              <w:bottom w:val="single" w:color="CCCCCC" w:sz="1"/>
-              <w:right w:val="single" w:color="CCCCCC" w:sz="1"/>
-            </w:tcBorders>
-            <w:shd w:fill="f0f2f8" w:val="clear"/>
-            <w:tcMar>
-              <w:top w:type="dxa" w:w="80"/>
-              <w:left w:type="dxa" w:w="120"/>
-              <w:bottom w:type="dxa" w:w="80"/>
-              <w:right w:type="dxa" w:w="120"/>
-            </w:tcMar>
-          </w:tcPr>
-          <w:p>
-            <w:r>
-              <w:rPr>
-                <w:b w:val="false"/>
-                <w:bCs w:val="false"/>
-                <w:color w:val="1a1a2e"/>
-                <w:sz w:val="20"/>
-                <w:szCs w:val="20"/>
-              </w:rPr>
-              <w:t xml:space="preserve">Phase 6 — Political Flip</w:t>
-            </w:r>
-          </w:p>
-        </w:tc>
-        <w:tc>
-          <w:tcPr>
-            <w:tcW w:type="dxa" w:w="1600"/>
-            <w:tcBorders>
-              <w:top w:val="single" w:color="CCCCCC" w:sz="1"/>
-              <w:left w:val="single" w:color="CCCCCC" w:sz="1"/>
-              <w:bottom w:val="single" w:color="CCCCCC" w:sz="1"/>
-              <w:right w:val="single" w:color="CCCCCC" w:sz="1"/>
-            </w:tcBorders>
-            <w:shd w:fill="f0f2f8" w:val="clear"/>
             <w:tcMar>
               <w:top w:type="dxa" w:w="80"/>
               <w:left w:type="dxa" w:w="120"/>
@@ -7735,98 +7937,6 @@
               <w:bottom w:val="single" w:color="CCCCCC" w:sz="1"/>
               <w:right w:val="single" w:color="CCCCCC" w:sz="1"/>
             </w:tcBorders>
-            <w:shd w:fill="f0f2f8" w:val="clear"/>
-            <w:tcMar>
-              <w:top w:type="dxa" w:w="80"/>
-              <w:left w:type="dxa" w:w="120"/>
-              <w:bottom w:type="dxa" w:w="80"/>
-              <w:right w:type="dxa" w:w="120"/>
-            </w:tcMar>
-          </w:tcPr>
-          <w:p>
-            <w:r>
-              <w:rPr>
-                <w:b w:val="false"/>
-                <w:bCs w:val="false"/>
-                <w:color w:val="1a1a2e"/>
-                <w:sz w:val="20"/>
-                <w:szCs w:val="20"/>
-              </w:rPr>
-              <w:t xml:space="preserve">Placeholder text and structure in place. Full research pending.</w:t>
-            </w:r>
-          </w:p>
-        </w:tc>
-      </w:tr>
-      <w:tr>
-        <w:tc>
-          <w:tcPr>
-            <w:tcW w:type="dxa" w:w="2200"/>
-            <w:tcBorders>
-              <w:top w:val="single" w:color="CCCCCC" w:sz="1"/>
-              <w:left w:val="single" w:color="CCCCCC" w:sz="1"/>
-              <w:bottom w:val="single" w:color="CCCCCC" w:sz="1"/>
-              <w:right w:val="single" w:color="CCCCCC" w:sz="1"/>
-            </w:tcBorders>
-            <w:shd w:fill="ffffff" w:val="clear"/>
-            <w:tcMar>
-              <w:top w:type="dxa" w:w="80"/>
-              <w:left w:type="dxa" w:w="120"/>
-              <w:bottom w:type="dxa" w:w="80"/>
-              <w:right w:type="dxa" w:w="120"/>
-            </w:tcMar>
-          </w:tcPr>
-          <w:p>
-            <w:r>
-              <w:rPr>
-                <w:b w:val="false"/>
-                <w:bCs w:val="false"/>
-                <w:color w:val="1a1a2e"/>
-                <w:sz w:val="20"/>
-                <w:szCs w:val="20"/>
-              </w:rPr>
-              <w:t xml:space="preserve">Phase 7 — Polish &amp; Distribution</w:t>
-            </w:r>
-          </w:p>
-        </w:tc>
-        <w:tc>
-          <w:tcPr>
-            <w:tcW w:type="dxa" w:w="1600"/>
-            <w:tcBorders>
-              <w:top w:val="single" w:color="CCCCCC" w:sz="1"/>
-              <w:left w:val="single" w:color="CCCCCC" w:sz="1"/>
-              <w:bottom w:val="single" w:color="CCCCCC" w:sz="1"/>
-              <w:right w:val="single" w:color="CCCCCC" w:sz="1"/>
-            </w:tcBorders>
-            <w:shd w:fill="ffffff" w:val="clear"/>
-            <w:tcMar>
-              <w:top w:type="dxa" w:w="80"/>
-              <w:left w:type="dxa" w:w="120"/>
-              <w:bottom w:type="dxa" w:w="80"/>
-              <w:right w:type="dxa" w:w="120"/>
-            </w:tcMar>
-          </w:tcPr>
-          <w:p>
-            <w:r>
-              <w:rPr>
-                <w:b w:val="false"/>
-                <w:bCs w:val="false"/>
-                <w:color w:val="8B0000"/>
-                <w:sz w:val="20"/>
-                <w:szCs w:val="20"/>
-              </w:rPr>
-              <w:t xml:space="preserve">⬜ Pending</w:t>
-            </w:r>
-          </w:p>
-        </w:tc>
-        <w:tc>
-          <w:tcPr>
-            <w:tcW w:type="dxa" w:w="5560"/>
-            <w:tcBorders>
-              <w:top w:val="single" w:color="CCCCCC" w:sz="1"/>
-              <w:left w:val="single" w:color="CCCCCC" w:sz="1"/>
-              <w:bottom w:val="single" w:color="CCCCCC" w:sz="1"/>
-              <w:right w:val="single" w:color="CCCCCC" w:sz="1"/>
-            </w:tcBorders>
             <w:shd w:fill="ffffff" w:val="clear"/>
             <w:tcMar>
               <w:top w:type="dxa" w:w="80"/>
@@ -7960,6 +8070,99 @@
           <w:szCs w:val="21"/>
         </w:rPr>
         <w:t xml:space="preserve">•  Persuasive to both left and right audiences by focusing on shared incentive structures, not partisan framing</w:t>
+      </w:r>
+    </w:p>
+    <w:p>
+      <w:r>
+        <w:rPr>
+          <w:b/>
+        </w:rPr>
+        <w:t>DECISIONS LOG — APRIL 2026</w:t>
+      </w:r>
+    </w:p>
+    <w:p>
+      <w:r>
+        <w:t>•  Platform renamed from "The H-1B/H-2 Visa Incentive Machine" to "The Manufactured Divide"</w:t>
+      </w:r>
+    </w:p>
+    <w:p>
+      <w:r>
+        <w:t>•  First module: "H-1B / H-2: The Visa Machine"</w:t>
+      </w:r>
+    </w:p>
+    <w:p>
+      <w:r>
+        <w:t>•  Architecture migrated from single HTML to multi-page static site on GitHub Pages</w:t>
+      </w:r>
+    </w:p>
+    <w:p>
+      <w:r>
+        <w:t>•  Home screen redesigned as D3 force-directed web with five module nodes</w:t>
+      </w:r>
+    </w:p>
+    <w:p>
+      <w:r>
+        <w:t>•  Color scheme: cream/navy/blue (v8 palette)</w:t>
+      </w:r>
+    </w:p>
+    <w:p>
+      <w:r>
+        <w:t>•  No center node on web — modules connect directly to each other</w:t>
+      </w:r>
+    </w:p>
+    <w:p>
+      <w:r>
+        <w:t>•  Tagline confirmed: "The argument is the product."</w:t>
+      </w:r>
+    </w:p>
+    <w:p>
+      <w:r>
+        <w:t>•  Jefferson 1820 quote added to hero with primary source link</w:t>
+      </w:r>
+    </w:p>
+    <w:p>
+      <w:r>
+        <w:t>•  AI disclosure added — research by human, AI used for coding and organization</w:t>
+      </w:r>
+    </w:p>
+    <w:p>
+      <w:r>
+        <w:t>•  Google Form feedback: https://forms.gle/fLaPAhALSbHqioBa6</w:t>
+      </w:r>
+    </w:p>
+    <w:p>
+      <w:r>
+        <w:t>•  University of Kentucky College of Law removed from all attribution</w:t>
+      </w:r>
+    </w:p>
+    <w:p>
+      <w:r>
+        <w:t>•  Credit: Created by Ian only</w:t>
+      </w:r>
+    </w:p>
+    <w:p>
+      <w:r>
+        <w:t>•  Phase 4 research complete April 2026 — build pending</w:t>
+      </w:r>
+    </w:p>
+    <w:p>
+      <w:r>
+        <w:t>•  Visa module rebuild deferred until Phase 6 research complete or near-complete</w:t>
+      </w:r>
+    </w:p>
+    <w:p>
+      <w:r>
+        <w:t>•  H-2 contractor layer identified as new structural insight — two-tier H-2 chain: Sponsors (FLCs) → Operating Companies → Asset Managers</w:t>
+      </w:r>
+    </w:p>
+    <w:p>
+      <w:r>
+        <w:t>•  TCS consulting scheme documented — Big Three own both outsourcers and end clients</w:t>
+      </w:r>
+    </w:p>
+    <w:p>
+      <w:r>
+        <w:t>•  University feedback loop and corporate espionage sections remain architecturally orphaned — placement decision pending</w:t>
       </w:r>
     </w:p>
     <w:sectPr>

</xml_diff>

<commit_message>
Fix outline v9: update build rules, remove stale Phase 4 pending items
</commit_message>
<xml_diff>
--- a/reference/visa/Visa_Project_Outline_v9.docx
+++ b/reference/visa/Visa_Project_Outline_v9.docx
@@ -4865,172 +4865,7 @@
         <w:spacing w:after="120" w:before="280"/>
       </w:pPr>
       <w:r>
-        <w:rPr>
-          <w:b/>
-          <w:bCs/>
-          <w:color w:val="2c3e6b"/>
-          <w:sz w:val="26"/>
-          <w:szCs w:val="26"/>
-        </w:rPr>
-        <w:t xml:space="preserve">Per-Company Research Needed (Phase 4)</w:t>
-      </w:r>
-    </w:p>
-    <w:p>
-      <w:pPr>
-        <w:spacing w:after="40" w:before="40"/>
-        <w:ind w:left="360" w:hanging="200"/>
-      </w:pPr>
-      <w:r>
-        <w:rPr>
-          <w:sz w:val="21"/>
-          <w:szCs w:val="21"/>
-        </w:rPr>
-        <w:t xml:space="preserve">•  4a: Visa count and year-over-year trend — USCIS Employer Data Hub</w:t>
-      </w:r>
-    </w:p>
-    <w:p>
-      <w:pPr>
-        <w:spacing w:after="40" w:before="40"/>
-        <w:ind w:left="360" w:hanging="200"/>
-      </w:pPr>
-      <w:r>
-        <w:rPr>
-          <w:sz w:val="21"/>
-          <w:szCs w:val="21"/>
-        </w:rPr>
-        <w:t xml:space="preserve">•  4b: Estimated labor cost savings — EPI prevailing wage methodology</w:t>
-      </w:r>
-    </w:p>
-    <w:p>
-      <w:pPr>
-        <w:spacing w:after="40" w:before="40"/>
-        <w:ind w:left="360" w:hanging="200"/>
-      </w:pPr>
-      <w:r>
-        <w:rPr>
-          <w:sz w:val="21"/>
-          <w:szCs w:val="21"/>
-        </w:rPr>
-        <w:t xml:space="preserve">•  4c: Ultimate ownership chain — Company → Parent → Institutional Holder → Asset Manager</w:t>
-      </w:r>
-    </w:p>
-    <w:p>
-      <w:pPr>
-        <w:spacing w:after="40" w:before="40"/>
-        <w:ind w:left="360" w:hanging="200"/>
-      </w:pPr>
-      <w:r>
-        <w:rPr>
-          <w:sz w:val="21"/>
-          <w:szCs w:val="21"/>
-        </w:rPr>
-        <w:t xml:space="preserve">•  4d: Federal contract receipts — USASpending.gov</w:t>
-      </w:r>
-    </w:p>
-    <w:p>
-      <w:pPr>
-        <w:spacing w:after="40" w:before="40"/>
-        <w:ind w:left="360" w:hanging="200"/>
-      </w:pPr>
-      <w:r>
-        <w:rPr>
-          <w:sz w:val="21"/>
-          <w:szCs w:val="21"/>
-        </w:rPr>
-        <w:t xml:space="preserve">•  4e: Lobbying expenditures — OpenSecrets</w:t>
-      </w:r>
-    </w:p>
-    <w:p>
-      <w:pPr>
-        <w:spacing w:after="40" w:before="40"/>
-        <w:ind w:left="360" w:hanging="200"/>
-      </w:pPr>
-      <w:r>
-        <w:rPr>
-          <w:sz w:val="21"/>
-          <w:szCs w:val="21"/>
-        </w:rPr>
-        <w:t xml:space="preserve">•  4f/4g: PAC contributions + layoff juxtaposition — FEC + WARN/8-K filings</w:t>
-      </w:r>
-    </w:p>
-    <w:p>
-      <w:pPr>
-        <w:spacing w:after="60" w:before="40"/>
-        <w:ind w:left="360"/>
-      </w:pPr>
-      <w:r>
-        <w:rPr>
-          <w:i/>
-          <w:iCs/>
-          <w:color w:val="b87c00"/>
-          <w:sz w:val="18"/>
-          <w:szCs w:val="18"/>
-        </w:rPr>
-        <w:t xml:space="preserve">⚑ Pending: USASpending.gov per-company contract data</w:t>
-      </w:r>
-    </w:p>
-    <w:p>
-      <w:pPr>
-        <w:spacing w:after="60" w:before="40"/>
-        <w:ind w:left="360"/>
-      </w:pPr>
-      <w:r>
-        <w:rPr>
-          <w:i/>
-          <w:iCs/>
-          <w:color w:val="b87c00"/>
-          <w:sz w:val="18"/>
-          <w:szCs w:val="18"/>
-        </w:rPr>
-        <w:t xml:space="preserve">⚑ Pending: OpenSecrets lobbying per company</w:t>
-      </w:r>
-    </w:p>
-    <w:p>
-      <w:pPr>
-        <w:spacing w:after="60" w:before="40"/>
-        <w:ind w:left="360"/>
-      </w:pPr>
-      <w:r>
-        <w:rPr>
-          <w:i/>
-          <w:iCs/>
-          <w:color w:val="b87c00"/>
-          <w:sz w:val="18"/>
-          <w:szCs w:val="18"/>
-        </w:rPr>
-        <w:t xml:space="preserve">⚑ Pending: FEC PAC contribution data</w:t>
-      </w:r>
-    </w:p>
-    <w:p>
-      <w:pPr>
-        <w:spacing w:after="60" w:before="40"/>
-        <w:ind w:left="360"/>
-      </w:pPr>
-      <w:r>
-        <w:rPr>
-          <w:i/>
-          <w:iCs/>
-          <w:color w:val="b87c00"/>
-          <w:sz w:val="18"/>
-          <w:szCs w:val="18"/>
-        </w:rPr>
-        <w:t xml:space="preserve">⚑ Pending: EPI wage savings calculations per employer</w:t>
-      </w:r>
-    </w:p>
-    <w:p>
-      <w:pPr>
-        <w:spacing w:after="60" w:before="40"/>
-        <w:ind w:left="360"/>
-      </w:pPr>
-      <w:r>
-        <w:rPr>
-          <w:i/>
-          <w:iCs/>
-          <w:color w:val="b87c00"/>
-          <w:sz w:val="18"/>
-          <w:szCs w:val="18"/>
-        </w:rPr>
-        <w:t xml:space="preserve">⚑ Pending: Documented layoff records by company and year</w:t>
+        <w:t>Phase 4 — Corporate Layer: COMPLETE April 2026 — see Chapter 09-A through 09-L in Master Research File. One remaining gap: H-2 PE intermediary chain (KKR/Blackstone) — confirmation pending.</w:t>
       </w:r>
     </w:p>
     <w:p>
@@ -8039,11 +7874,7 @@
         <w:ind w:left="360" w:hanging="200"/>
       </w:pPr>
       <w:r>
-        <w:rPr>
-          <w:sz w:val="21"/>
-          <w:szCs w:val="21"/>
-        </w:rPr>
-        <w:t xml:space="preserve">•  Single HTML file — no install, no login, no internet required after initial load</w:t>
+        <w:t>•  Hosted multi-page static site on GitHub Pages — no install, no login required. All pages accessible via URL. Works in any browser.</w:t>
       </w:r>
     </w:p>
     <w:p>

</xml_diff>

<commit_message>
Add H-2B research to outline v9: program size, wages, enforcement, sources
</commit_message>
<xml_diff>
--- a/reference/visa/Visa_Project_Outline_v9.docx
+++ b/reference/visa/Visa_Project_Outline_v9.docx
@@ -2740,6 +2740,31 @@
           <w:szCs w:val="21"/>
         </w:rPr>
         <w:t xml:space="preserve">H-2B FY2026 Q1: ~39k certified; full-year routinely &gt;200k–230k</w:t>
+      </w:r>
+    </w:p>
+    <w:p>
+      <w:r>
+        <w:t>•  H-2B true program size FY2024: 169,177 workers actually employed — more than 2.5x the original statutory cap of 66,000</w:t>
+      </w:r>
+    </w:p>
+    <w:p>
+      <w:r>
+        <w:t>•  H-2B statutory cap: 66,000 (set by Congress 1992, never raised by legislation). Supplemental cap: DHS authorized to add up to 64,716 additional visas per year via annual appropriations riders — both parties authorized this every year since FY2016</w:t>
+      </w:r>
+    </w:p>
+    <w:p>
+      <w:r>
+        <w:t>•  Average certified H-2B job duration: 232 days (7.6 months). 53% of positions run 8+ months. 28% run 9 months — the legal maximum. Program legally defined as temporary; operational reality is near-permanent.</w:t>
+      </w:r>
+    </w:p>
+    <w:p>
+      <w:r>
+        <w:t>•  Top-10 H-2B occupations account for 98.8% of all approvals. Landscaping alone: 45.86%. Program concentrated in low-wage industries with documented wage theft histories.</w:t>
+      </w:r>
+    </w:p>
+    <w:p>
+      <w:r>
+        <w:t>✓ SOURCE: EPI analysis of USCIS H-2B Employer Data Hub + DOL OFLC Performance Data FY2024 — epi.org/310379</w:t>
       </w:r>
     </w:p>
     <w:p>
@@ -4303,6 +4328,26 @@
       </w:r>
     </w:p>
     <w:p>
+      <w:r>
+        <w:t>•  H-2B certified wages below national OEWS average in ALL top-15 occupations FY2024 — the same dataset DOL uses to set H-2B wage minimums. Largest gaps: Forest workers 24.7% below / Meat poultry fish cutters 22.2% below / Construction laborers 15.4% below / Landscaping 10.7% below (37% of all H-2B jobs)</w:t>
+      </w:r>
+    </w:p>
+    <w:p>
+      <w:r>
+        <w:t>•  Meatpacking H-2B certified wage: $16.66/hr vs. U.S.-born industry average $26.20/hr — H-2B workers certified at 63.6% of what U.S.-born workers earn in the same sector</w:t>
+      </w:r>
+    </w:p>
+    <w:p>
+      <w:r>
+        <w:t>•  Employer private wage survey loophole: H-2B employers can substitute private surveys to set wages below local OEWS averages. Seafood industry documented use of this mechanism.</w:t>
+      </w:r>
+    </w:p>
+    <w:p>
+      <w:r>
+        <w:t>✓ SOURCE: EPI analysis of BLS OEWS 2024 + DOL OFLC H-2B Performance Data FY2024 — epi.org/310379</w:t>
+      </w:r>
+    </w:p>
+    <w:p>
       <w:pPr>
         <w:spacing w:after="60" w:before="0"/>
         <w:ind w:left="560"/>
@@ -4544,6 +4589,31 @@
           <w:szCs w:val="21"/>
         </w:rPr>
         <w:t xml:space="preserve">2024 Farmworker Protection Rule suspended June 2025; proposed rescission July 2025</w:t>
+      </w:r>
+    </w:p>
+    <w:p>
+      <w:r>
+        <w:t>•  H-2B industry wage theft FY2000–2024 (inflation-adjusted to 2024 dollars): $2,238,327,967 total back wages assessed across 7 major H-2B industries — $89.5 million stolen per year on average. 1,822,164 workers assessed as wage theft victims. NOTE: Covers all workers in these industries (U.S.-born, green card holders, H-2B workers, unauthorized workers) — demonstrates wage suppression affects entire industry, not just visa holders.</w:t>
+      </w:r>
+    </w:p>
+    <w:p>
+      <w:r>
+        <w:t>•  By industry: Construction $1.05B (avg $1,768/worker) / Food services $829M / Janitorial $119M / Hotels and motels $106M / Landscaping $77M / Amusement $40M / Forestry $14M</w:t>
+      </w:r>
+    </w:p>
+    <w:p>
+      <w:r>
+        <w:t>•  WHD enforcement capacity: Only 611 investigators as of May 2025 policing 170 million workers — record low</w:t>
+      </w:r>
+    </w:p>
+    <w:p>
+      <w:r>
+        <w:t>•  Meatpacking employer strategy (documented 1983–2024): As meatpacking unionization fell from 37.4% (1983) to 13.5% (2024), foreign-born share rose to 42%+. Intentional employer strategy — aggressive recruitment of non-union immigrant labor to suppress bargaining power. Employers now lobbying Congress to expand H-2B to year-round meatpacking jobs — currently prohibited because H-2B requires temporary work.</w:t>
+      </w:r>
+    </w:p>
+    <w:p>
+      <w:r>
+        <w:t>✓ SOURCE: DOL WHD Industries with High Prevalence of H-2B Workers FY2000–2024 — dol.gov/agencies/whd / Workplace Justice Lab Rutgers May 2025 / EPI September 2025 — epi.org/310379</w:t>
       </w:r>
     </w:p>
     <w:p>
@@ -6823,6 +6893,26 @@
           <w:szCs w:val="21"/>
         </w:rPr>
         <w:t xml:space="preserve">•  Centro de los Derechos del Migrante — cdmigrante.org/h2-visa-worker-rights/</w:t>
+      </w:r>
+    </w:p>
+    <w:p>
+      <w:r>
+        <w:t>•  EPI September 2025 H-2B Report (Costa and Bivens) — epi.org/310379 — program size, wage suppression, $2.24B wage theft aggregate, meatpacking employer strategy</w:t>
+      </w:r>
+    </w:p>
+    <w:p>
+      <w:r>
+        <w:t>•  DOL WHD Industries with High Prevalence of H-2B Workers FY2000–2024 — dol.gov/agencies/whd</w:t>
+      </w:r>
+    </w:p>
+    <w:p>
+      <w:r>
+        <w:t>•  USCIS H-2B Employer Data Hub — uscis.gov/tools/reports-and-studies/h-2b-employer-data-hub</w:t>
+      </w:r>
+    </w:p>
+    <w:p>
+      <w:r>
+        <w:t>•  Workplace Justice Lab Rutgers University May 2025 — 611 WHD investigators for 170M-worker labor market</w:t>
       </w:r>
     </w:p>
     <w:p>

</xml_diff>